<commit_message>
laneA(F0L): M27 source chuan TT 121/2026 (p67 khoi NDD 3 dong, bo SDT-trung-CSDL-dan-cu; danh so lai chu thich) + rule dia_chi_thu_dien_tu + inventory
</commit_message>
<xml_diff>
--- a/04_tam_ngung_cham_dut_giai_the/PL1_Mau_27_thong_bao_ve_viec_tam_ngung_kinh_doanh_tiep_tuc_kinh_doanh_truoc_thoi_han_da_thong_bao_cua_doanh.docx
+++ b/04_tam_ngung_cham_dut_giai_the/PL1_Mau_27_thong_bao_ve_viec_tam_ngung_kinh_doanh_tiep_tuc_kinh_doanh_truoc_thoi_han_da_thong_bao_cua_doanh.docx
@@ -367,46 +367,7 @@
           <w:sz w:val="24"/>
           <w:sz-cs w:val="24"/>
         </w:rPr>
-        <w:t xml:space="preserve">1. Họ, chữ đệm và tên: …………………………………………………………………………</w:t>
-      </w:r>
-    </w:p>
-    <w:p>
-      <w:pPr>
-        <w:spacing w:before="120"/>
-      </w:pPr>
-      <w:r>
-        <w:rPr>
-          <w:rFonts w:ascii="Arial" w:hAnsi="Arial" w:cs="Arial"/>
-          <w:sz w:val="24"/>
-          <w:sz-cs w:val="24"/>
-        </w:rPr>
-        <w:t xml:space="preserve">Ngày, tháng, năm sinh: ……../……./……………</w:t>
-      </w:r>
-    </w:p>
-    <w:p>
-      <w:pPr>
-        <w:spacing w:before="120"/>
-      </w:pPr>
-      <w:r>
-        <w:rPr>
-          <w:rFonts w:ascii="Arial" w:hAnsi="Arial" w:cs="Arial"/>
-          <w:sz w:val="24"/>
-          <w:sz-cs w:val="24"/>
-        </w:rPr>
-        <w:t xml:space="preserve">Giới tính: ……………………………………………</w:t>
-      </w:r>
-    </w:p>
-    <w:p>
-      <w:pPr>
-        <w:spacing w:before="120"/>
-      </w:pPr>
-      <w:r>
-        <w:rPr>
-          <w:rFonts w:ascii="Arial" w:hAnsi="Arial" w:cs="Arial"/>
-          <w:sz w:val="24"/>
-          <w:sz-cs w:val="24"/>
-        </w:rPr>
-        <w:t xml:space="preserve">Số định danh cá nhân: ………………………………………………………………………………</w:t>
+        <w:t>Họ, chữ đệm và tên: …………………………………………………………………………</w:t>
       </w:r>
     </w:p>
     <w:p>
@@ -449,33 +410,7 @@
           <w:sz w:val="24"/>
           <w:sz-cs w:val="24"/>
         </w:rPr>
-        <w:t xml:space="preserve">Địa chỉ liên hệ: …………………………………………………………………………………………</w:t>
-      </w:r>
-    </w:p>
-    <w:p>
-      <w:pPr>
-        <w:spacing w:before="120"/>
-      </w:pPr>
-      <w:r>
-        <w:rPr>
-          <w:rFonts w:ascii="Arial" w:hAnsi="Arial" w:cs="Arial"/>
-          <w:sz w:val="24"/>
-          <w:sz-cs w:val="24"/>
-        </w:rPr>
-        <w:t xml:space="preserve">2. Họ, chữ đệm và tên: ………………………………………………………………………………</w:t>
-      </w:r>
-    </w:p>
-    <w:p>
-      <w:pPr>
-        <w:spacing w:before="120"/>
-      </w:pPr>
-      <w:r>
-        <w:rPr>
-          <w:rFonts w:ascii="Arial" w:hAnsi="Arial" w:cs="Arial"/>
-          <w:sz w:val="24"/>
-          <w:sz-cs w:val="24"/>
-        </w:rPr>
-        <w:t xml:space="preserve">…</w:t>
+        <w:t>Địa chỉ thư điện tử4: ………………………………………………………………………………………</w:t>
       </w:r>
     </w:p>
     <w:p>
@@ -736,7 +671,7 @@
           <w:sz-cs w:val="24"/>
           <w:i/>
         </w:rPr>
-        <w:t xml:space="preserve">2. Trường hợp tiếp tục kinh doanh/hoạt động trước thời hạn đã thông báo</w:t>
+        <w:t>2. Trường hợp tiếp tục kinh doanh/hoạt động trước thời hạn đã thông báo5:</w:t>
       </w:r>
       <w:r>
         <w:rPr>
@@ -746,16 +681,14 @@
           <w:i/>
           <w:vertAlign w:val="superscript"/>
         </w:rPr>
-        <w:t xml:space="preserve">4</w:t>
-      </w:r>
-      <w:r>
-        <w:rPr>
-          <w:rFonts w:ascii="Arial" w:hAnsi="Arial" w:cs="Arial"/>
-          <w:sz w:val="24"/>
-          <w:sz-cs w:val="24"/>
-          <w:i/>
-        </w:rPr>
-        <w:t xml:space="preserve">:</w:t>
+      </w:r>
+      <w:r>
+        <w:rPr>
+          <w:rFonts w:ascii="Arial" w:hAnsi="Arial" w:cs="Arial"/>
+          <w:sz w:val="24"/>
+          <w:sz-cs w:val="24"/>
+          <w:i/>
+        </w:rPr>
       </w:r>
     </w:p>
     <w:p>
@@ -1126,28 +1059,22 @@
           <w:sz-cs w:val="24"/>
           <w:b/>
         </w:rPr>
-        <w:t xml:space="preserve">NGƯỜI ĐẠI DIỆN THEO PHÁP LUẬT</w:t>
-        <w:br/>
-        <w:t xml:space="preserve">CỦA DOANH NGHIỆP/ NGƯỜI ĐỨNG ĐẦU CHI NHÁNH</w:t>
-        <w:br/>
-        <w:t xml:space="preserve"/>
-      </w:r>
-      <w:r>
-        <w:rPr>
-          <w:rFonts w:ascii="Arial" w:hAnsi="Arial" w:cs="Arial"/>
-          <w:sz w:val="24"/>
-          <w:sz-cs w:val="24"/>
-        </w:rPr>
-        <w:t xml:space="preserve">(</w:t>
-      </w:r>
-      <w:r>
-        <w:rPr>
-          <w:rFonts w:ascii="Arial" w:hAnsi="Arial" w:cs="Arial"/>
-          <w:sz w:val="24"/>
-          <w:sz-cs w:val="24"/>
-          <w:i/>
-        </w:rPr>
-        <w:t xml:space="preserve">Ký và ghi họ tên)</w:t>
+        <w:t>(Ký và ghi họ tên)6</w:t>
+      </w:r>
+      <w:r>
+        <w:rPr>
+          <w:rFonts w:ascii="Arial" w:hAnsi="Arial" w:cs="Arial"/>
+          <w:sz w:val="24"/>
+          <w:sz-cs w:val="24"/>
+        </w:rPr>
+      </w:r>
+      <w:r>
+        <w:rPr>
+          <w:rFonts w:ascii="Arial" w:hAnsi="Arial" w:cs="Arial"/>
+          <w:sz w:val="24"/>
+          <w:sz-cs w:val="24"/>
+          <w:i/>
+        </w:rPr>
       </w:r>
       <w:r>
         <w:rPr>
@@ -1157,7 +1084,6 @@
           <w:i/>
           <w:vertAlign w:val="superscript"/>
         </w:rPr>
-        <w:t xml:space="preserve">5</w:t>
       </w:r>
       <w:r>
         <w:rPr>
@@ -1166,7 +1092,6 @@
           <w:sz-cs w:val="24"/>
           <w:b/>
         </w:rPr>
-        <w:t xml:space="preserve"/>
       </w:r>
     </w:p>
     <w:p>
@@ -1216,15 +1141,14 @@
           <w:sz-cs w:val="24"/>
           <w:vertAlign w:val="superscript"/>
         </w:rPr>
-        <w:t xml:space="preserve">2</w:t>
-      </w:r>
-      <w:r>
-        <w:rPr>
-          <w:rFonts w:ascii="Arial" w:hAnsi="Arial" w:cs="Arial"/>
-          <w:sz w:val="24"/>
-          <w:sz-cs w:val="24"/>
-        </w:rPr>
-        <w:t xml:space="preserve"> Kê khai thông tin của tất cả người đại diện theo pháp luật của doanh nghiệp.</w:t>
+        <w:t>2 Trường hợp có nhiều hơn một người đại diện theo pháp luật, doanh nghiệp có thể chọn kê khai thông tin của 01 hoặc nhiều người đại diện theo pháp luật vào phần này.</w:t>
+      </w:r>
+      <w:r>
+        <w:rPr>
+          <w:rFonts w:ascii="Arial" w:hAnsi="Arial" w:cs="Arial"/>
+          <w:sz w:val="24"/>
+          <w:sz-cs w:val="24"/>
+        </w:rPr>
       </w:r>
     </w:p>
     <w:p>
@@ -1238,15 +1162,14 @@
           <w:sz-cs w:val="24"/>
           <w:vertAlign w:val="superscript"/>
         </w:rPr>
-        <w:t xml:space="preserve">3</w:t>
-      </w:r>
-      <w:r>
-        <w:rPr>
-          <w:rFonts w:ascii="Arial" w:hAnsi="Arial" w:cs="Arial"/>
-          <w:sz w:val="24"/>
-          <w:sz-cs w:val="24"/>
-        </w:rPr>
-        <w:t xml:space="preserve"> Số điện thoại của người đại diện theo pháp luật phải trùng với số điện thoại đã kê khai trong Cơ sở dữ liệu quốc gia về dân cư.</w:t>
+        <w:t>3,4 Doanh nghiệp kê khai số điện thoại, thư điện tử để nhận thông báo từ cơ quan đăng ký kinh doanh.</w:t>
+      </w:r>
+      <w:r>
+        <w:rPr>
+          <w:rFonts w:ascii="Arial" w:hAnsi="Arial" w:cs="Arial"/>
+          <w:sz w:val="24"/>
+          <w:sz-cs w:val="24"/>
+        </w:rPr>
       </w:r>
     </w:p>
     <w:p>
@@ -1260,15 +1183,14 @@
           <w:sz-cs w:val="24"/>
           <w:vertAlign w:val="superscript"/>
         </w:rPr>
-        <w:t xml:space="preserve">4</w:t>
-      </w:r>
-      <w:r>
-        <w:rPr>
-          <w:rFonts w:ascii="Arial" w:hAnsi="Arial" w:cs="Arial"/>
-          <w:sz w:val="24"/>
-          <w:sz-cs w:val="24"/>
-        </w:rPr>
-        <w:t xml:space="preserve"> Doanh nghiệp gửi thông báo đến Cơ quan đăng ký kinh doanh cấp tỉnh nơi doanh nghiệp, chi nhánh/văn phòng đại diện/địa điểm kinh doanh đã đăng ký chậm nhất 03 ngày làm việc trước khi tiếp tục kinh doanh/hoạt động trước thời hạn đã thông báo.</w:t>
+        <w:t>5 Doanh nghiệp gửi thông báo đến Cơ quan đăng ký kinh doanh cấp tỉnh nơi doanh nghiệp, chi nhánh/văn phòng đại diện/địa điểm kinh doanh đã đăng ký chậm nhất 03 ngày làm việc trước khi tiếp tục kinh doanh/hoạt động trước thời hạn đã thông báo.</w:t>
+      </w:r>
+      <w:r>
+        <w:rPr>
+          <w:rFonts w:ascii="Arial" w:hAnsi="Arial" w:cs="Arial"/>
+          <w:sz w:val="24"/>
+          <w:sz-cs w:val="24"/>
+        </w:rPr>
       </w:r>
     </w:p>
     <w:p>

</xml_diff>

<commit_message>
F0L(lead): tích hợp sau merge 4 lane — M27/M30 khôi phục khối ký ký hiệu mới (p69/p70), M27 superscript 4/5, GRID_META.ds_cshhl 2026 (17 tag + 2 tổng computed output-only), harness test_loop_prod rowspan-aware, pin p2a/r3b1/glue/glue-registry M10-M12 sync current-law
Còn đỏ (đang xử lý bởi agent tích hợp): test_loop_prod 1 FAIL (title row M10), phase5r_tables C1a (M10 18 cột), header_layout census (band M12 mới), check_layout_l1, H7.4 allowlist
</commit_message>
<xml_diff>
--- a/04_tam_ngung_cham_dut_giai_the/PL1_Mau_27_thong_bao_ve_viec_tam_ngung_kinh_doanh_tiep_tuc_kinh_doanh_truoc_thoi_han_da_thong_bao_cua_doanh.docx
+++ b/04_tam_ngung_cham_dut_giai_the/PL1_Mau_27_thong_bao_ve_viec_tam_ngung_kinh_doanh_tiep_tuc_kinh_doanh_truoc_thoi_han_da_thong_bao_cua_doanh.docx
@@ -410,7 +410,16 @@
           <w:sz w:val="24"/>
           <w:sz-cs w:val="24"/>
         </w:rPr>
-        <w:t>Địa chỉ thư điện tử4: ………………………………………………………………………………………</w:t>
+        <w:t>Địa chỉ thư điện tử</w:t>
+      </w:r>
+      <w:r>
+        <w:rPr>
+          <w:vertAlign w:val="superscript"/>
+        </w:rPr>
+        <w:t>4</w:t>
+      </w:r>
+      <w:r>
+        <w:t>: ………………………………………………………………………………………</w:t>
       </w:r>
     </w:p>
     <w:p>
@@ -671,7 +680,7 @@
           <w:sz-cs w:val="24"/>
           <w:i/>
         </w:rPr>
-        <w:t>2. Trường hợp tiếp tục kinh doanh/hoạt động trước thời hạn đã thông báo5:</w:t>
+        <w:t>2. Trường hợp tiếp tục kinh doanh/hoạt động trước thời hạn đã thông báo</w:t>
       </w:r>
       <w:r>
         <w:rPr>
@@ -690,6 +699,15 @@
           <w:i/>
         </w:rPr>
       </w:r>
+      <w:r>
+        <w:rPr>
+          <w:vertAlign w:val="superscript"/>
+        </w:rPr>
+        <w:t>5</w:t>
+      </w:r>
+      <w:r>
+        <w:t>:</w:t>
+      </w:r>
     </w:p>
     <w:p>
       <w:pPr>
@@ -1026,72 +1044,32 @@
         <w:spacing w:before="120"/>
       </w:pPr>
       <w:r>
+        <w:t>NGƯỜI ĐẠI DIỆN THEO PHÁP LUẬT</w:t>
+        <w:br/>
+        <w:t>CỦA DOANH NGHIỆP/</w:t>
+        <w:br/>
+        <w:t>NGƯỜI ĐỨNG ĐẦU CHI NHÁNH</w:t>
+        <w:br/>
+        <w:t>(Ký và ghi họ tên)</w:t>
+      </w:r>
+      <w:r>
+        <w:rPr>
+          <w:vertAlign w:val="superscript"/>
+        </w:rPr>
+        <w:t>6</w:t>
+      </w:r>
+    </w:p>
+    <w:p>
+      <w:pPr>
+        <w:spacing w:before="120"/>
+      </w:pPr>
+      <w:r>
         <w:rPr>
           <w:rFonts w:ascii="Arial" w:hAnsi="Arial" w:cs="Arial"/>
           <w:sz w:val="24"/>
           <w:sz-cs w:val="24"/>
         </w:rPr>
         <w:t xml:space="preserve"/>
-      </w:r>
-    </w:p>
-    <w:p>
-      <w:pPr>
-        <w:spacing w:before="120"/>
-      </w:pPr>
-      <w:r>
-        <w:rPr>
-          <w:rFonts w:ascii="Arial" w:hAnsi="Arial" w:cs="Arial"/>
-          <w:sz w:val="24"/>
-          <w:sz-cs w:val="24"/>
-        </w:rPr>
-        <w:t xml:space="preserve"/>
-      </w:r>
-    </w:p>
-    <w:p>
-      <w:pPr>
-        <w:jc w:val="center"/>
-        <w:spacing w:before="120"/>
-      </w:pPr>
-      <w:r>
-        <w:rPr>
-          <w:rFonts w:ascii="Arial" w:hAnsi="Arial" w:cs="Arial"/>
-          <w:sz w:val="24"/>
-          <w:sz-cs w:val="24"/>
-          <w:b/>
-        </w:rPr>
-        <w:t>(Ký và ghi họ tên)6</w:t>
-      </w:r>
-      <w:r>
-        <w:rPr>
-          <w:rFonts w:ascii="Arial" w:hAnsi="Arial" w:cs="Arial"/>
-          <w:sz w:val="24"/>
-          <w:sz-cs w:val="24"/>
-        </w:rPr>
-      </w:r>
-      <w:r>
-        <w:rPr>
-          <w:rFonts w:ascii="Arial" w:hAnsi="Arial" w:cs="Arial"/>
-          <w:sz w:val="24"/>
-          <w:sz-cs w:val="24"/>
-          <w:i/>
-        </w:rPr>
-      </w:r>
-      <w:r>
-        <w:rPr>
-          <w:rFonts w:ascii="Arial" w:hAnsi="Arial" w:cs="Arial"/>
-          <w:sz w:val="24"/>
-          <w:sz-cs w:val="24"/>
-          <w:i/>
-          <w:vertAlign w:val="superscript"/>
-        </w:rPr>
-      </w:r>
-      <w:r>
-        <w:rPr>
-          <w:rFonts w:ascii="Arial" w:hAnsi="Arial" w:cs="Arial"/>
-          <w:sz w:val="24"/>
-          <w:sz-cs w:val="24"/>
-          <w:b/>
-        </w:rPr>
       </w:r>
     </w:p>
     <w:p>

</xml_diff>